<commit_message>
draft one final code
</commit_message>
<xml_diff>
--- a/tables/table_coherence_clusters.docx
+++ b/tables/table_coherence_clusters.docx
@@ -352,127 +352,127 @@
                 <w:rFonts w:ascii="Calibri" w:hAnsi="Calibri"/>
                 <w:sz w:val="20"/>
               </w:rPr>
-              <w:t xml:space="default">4</w:t>
-            </w:r>
-          </w:p>
-        </w:tc>
-        <w:tc>
-          <w:tcPr>
-            <w:tcBorders>
-              <w:top w:val="single" w:space="0" w:color="D3D3D3"/>
-              <w:bottom w:val="single" w:space="0" w:color="D3D3D3"/>
-              <w:start w:val="single" w:space="0" w:color="D3D3D3"/>
-              <w:end w:val="single" w:space="0" w:color="D3D3D3"/>
-            </w:tcBorders>
-          </w:tcPr>
-          <w:p>
-            <w:pPr>
-              <w:spacing w:before="0" w:after="60"/>
-              <w:keepNext/>
-              <w:jc w:val="center"/>
-            </w:pPr>
-            <w:r>
-              <w:rPr>
-                <w:rFonts w:ascii="Calibri" w:hAnsi="Calibri"/>
-                <w:sz w:val="20"/>
-              </w:rPr>
-              <w:t xml:space="default">5</w:t>
-            </w:r>
-          </w:p>
-        </w:tc>
-        <w:tc>
-          <w:tcPr>
-            <w:tcBorders>
-              <w:top w:val="single" w:space="0" w:color="D3D3D3"/>
-              <w:bottom w:val="single" w:space="0" w:color="D3D3D3"/>
-              <w:start w:val="single" w:space="0" w:color="D3D3D3"/>
-              <w:end w:val="single" w:space="0" w:color="D3D3D3"/>
-            </w:tcBorders>
-          </w:tcPr>
-          <w:p>
-            <w:pPr>
-              <w:spacing w:before="0" w:after="60"/>
-              <w:keepNext/>
-              <w:jc w:val="center"/>
-            </w:pPr>
-            <w:r>
-              <w:rPr>
-                <w:rFonts w:ascii="Calibri" w:hAnsi="Calibri"/>
-                <w:sz w:val="20"/>
-              </w:rPr>
-              <w:t xml:space="default">0.833</w:t>
-            </w:r>
-          </w:p>
-        </w:tc>
-        <w:tc>
-          <w:tcPr>
-            <w:tcBorders>
-              <w:top w:val="single" w:space="0" w:color="D3D3D3"/>
-              <w:bottom w:val="single" w:space="0" w:color="D3D3D3"/>
-              <w:start w:val="single" w:space="0" w:color="D3D3D3"/>
-              <w:end w:val="single" w:space="0" w:color="D3D3D3"/>
-            </w:tcBorders>
-          </w:tcPr>
-          <w:p>
-            <w:pPr>
-              <w:spacing w:before="0" w:after="60"/>
-              <w:keepNext/>
-              <w:jc w:val="center"/>
-            </w:pPr>
-            <w:r>
-              <w:rPr>
-                <w:rFonts w:ascii="Calibri" w:hAnsi="Calibri"/>
-                <w:sz w:val="20"/>
-              </w:rPr>
-              <w:t xml:space="default">16.9</w:t>
-            </w:r>
-          </w:p>
-        </w:tc>
-        <w:tc>
-          <w:tcPr>
-            <w:tcBorders>
-              <w:top w:val="single" w:space="0" w:color="D3D3D3"/>
-              <w:bottom w:val="single" w:space="0" w:color="D3D3D3"/>
-              <w:start w:val="single" w:space="0" w:color="D3D3D3"/>
-              <w:end w:val="single" w:space="0" w:color="D3D3D3"/>
-            </w:tcBorders>
-          </w:tcPr>
-          <w:p>
-            <w:pPr>
-              <w:spacing w:before="0" w:after="60"/>
-              <w:keepNext/>
-              <w:jc w:val="center"/>
-            </w:pPr>
-            <w:r>
-              <w:rPr>
-                <w:rFonts w:ascii="Calibri" w:hAnsi="Calibri"/>
-                <w:sz w:val="20"/>
-              </w:rPr>
-              <w:t xml:space="default">9.1</w:t>
-            </w:r>
-          </w:p>
-        </w:tc>
-        <w:tc>
-          <w:tcPr>
-            <w:tcBorders>
-              <w:top w:val="single" w:space="0" w:color="D3D3D3"/>
-              <w:bottom w:val="single" w:space="0" w:color="D3D3D3"/>
-              <w:start w:val="single" w:space="0" w:color="D3D3D3"/>
-              <w:end w:val="single" w:space="0" w:color="D3D3D3"/>
-            </w:tcBorders>
-          </w:tcPr>
-          <w:p>
-            <w:pPr>
-              <w:spacing w:before="0" w:after="60"/>
-              <w:keepNext/>
-              <w:jc w:val="center"/>
-            </w:pPr>
-            <w:r>
-              <w:rPr>
-                <w:rFonts w:ascii="Calibri" w:hAnsi="Calibri"/>
-                <w:sz w:val="20"/>
-              </w:rPr>
-              <w:t xml:space="default">0.833</w:t>
+              <w:t xml:space="default">3</w:t>
+            </w:r>
+          </w:p>
+        </w:tc>
+        <w:tc>
+          <w:tcPr>
+            <w:tcBorders>
+              <w:top w:val="single" w:space="0" w:color="D3D3D3"/>
+              <w:bottom w:val="single" w:space="0" w:color="D3D3D3"/>
+              <w:start w:val="single" w:space="0" w:color="D3D3D3"/>
+              <w:end w:val="single" w:space="0" w:color="D3D3D3"/>
+            </w:tcBorders>
+          </w:tcPr>
+          <w:p>
+            <w:pPr>
+              <w:spacing w:before="0" w:after="60"/>
+              <w:keepNext/>
+              <w:jc w:val="center"/>
+            </w:pPr>
+            <w:r>
+              <w:rPr>
+                <w:rFonts w:ascii="Calibri" w:hAnsi="Calibri"/>
+                <w:sz w:val="20"/>
+              </w:rPr>
+              <w:t xml:space="default">3</w:t>
+            </w:r>
+          </w:p>
+        </w:tc>
+        <w:tc>
+          <w:tcPr>
+            <w:tcBorders>
+              <w:top w:val="single" w:space="0" w:color="D3D3D3"/>
+              <w:bottom w:val="single" w:space="0" w:color="D3D3D3"/>
+              <w:start w:val="single" w:space="0" w:color="D3D3D3"/>
+              <w:end w:val="single" w:space="0" w:color="D3D3D3"/>
+            </w:tcBorders>
+          </w:tcPr>
+          <w:p>
+            <w:pPr>
+              <w:spacing w:before="0" w:after="60"/>
+              <w:keepNext/>
+              <w:jc w:val="center"/>
+            </w:pPr>
+            <w:r>
+              <w:rPr>
+                <w:rFonts w:ascii="Calibri" w:hAnsi="Calibri"/>
+                <w:sz w:val="20"/>
+              </w:rPr>
+              <w:t xml:space="default">1.000</w:t>
+            </w:r>
+          </w:p>
+        </w:tc>
+        <w:tc>
+          <w:tcPr>
+            <w:tcBorders>
+              <w:top w:val="single" w:space="0" w:color="D3D3D3"/>
+              <w:bottom w:val="single" w:space="0" w:color="D3D3D3"/>
+              <w:start w:val="single" w:space="0" w:color="D3D3D3"/>
+              <w:end w:val="single" w:space="0" w:color="D3D3D3"/>
+            </w:tcBorders>
+          </w:tcPr>
+          <w:p>
+            <w:pPr>
+              <w:spacing w:before="0" w:after="60"/>
+              <w:keepNext/>
+              <w:jc w:val="center"/>
+            </w:pPr>
+            <w:r>
+              <w:rPr>
+                <w:rFonts w:ascii="Calibri" w:hAnsi="Calibri"/>
+                <w:sz w:val="20"/>
+              </w:rPr>
+              <w:t xml:space="default">3.2</w:t>
+            </w:r>
+          </w:p>
+        </w:tc>
+        <w:tc>
+          <w:tcPr>
+            <w:tcBorders>
+              <w:top w:val="single" w:space="0" w:color="D3D3D3"/>
+              <w:bottom w:val="single" w:space="0" w:color="D3D3D3"/>
+              <w:start w:val="single" w:space="0" w:color="D3D3D3"/>
+              <w:end w:val="single" w:space="0" w:color="D3D3D3"/>
+            </w:tcBorders>
+          </w:tcPr>
+          <w:p>
+            <w:pPr>
+              <w:spacing w:before="0" w:after="60"/>
+              <w:keepNext/>
+              <w:jc w:val="center"/>
+            </w:pPr>
+            <w:r>
+              <w:rPr>
+                <w:rFonts w:ascii="Calibri" w:hAnsi="Calibri"/>
+                <w:sz w:val="20"/>
+              </w:rPr>
+              <w:t xml:space="default">2.7</w:t>
+            </w:r>
+          </w:p>
+        </w:tc>
+        <w:tc>
+          <w:tcPr>
+            <w:tcBorders>
+              <w:top w:val="single" w:space="0" w:color="D3D3D3"/>
+              <w:bottom w:val="single" w:space="0" w:color="D3D3D3"/>
+              <w:start w:val="single" w:space="0" w:color="D3D3D3"/>
+              <w:end w:val="single" w:space="0" w:color="D3D3D3"/>
+            </w:tcBorders>
+          </w:tcPr>
+          <w:p>
+            <w:pPr>
+              <w:spacing w:before="0" w:after="60"/>
+              <w:keepNext/>
+              <w:jc w:val="center"/>
+            </w:pPr>
+            <w:r>
+              <w:rPr>
+                <w:rFonts w:ascii="Calibri" w:hAnsi="Calibri"/>
+                <w:sz w:val="20"/>
+              </w:rPr>
+              <w:t xml:space="default">1.000</w:t>
             </w:r>
           </w:p>
         </w:tc>
@@ -549,127 +549,127 @@
                 <w:rFonts w:ascii="Calibri" w:hAnsi="Calibri"/>
                 <w:sz w:val="20"/>
               </w:rPr>
-              <w:t xml:space="default">7</w:t>
-            </w:r>
-          </w:p>
-        </w:tc>
-        <w:tc>
-          <w:tcPr>
-            <w:tcBorders>
-              <w:top w:val="single" w:space="0" w:color="D3D3D3"/>
-              <w:bottom w:val="single" w:space="0" w:color="D3D3D3"/>
-              <w:start w:val="single" w:space="0" w:color="D3D3D3"/>
-              <w:end w:val="single" w:space="0" w:color="D3D3D3"/>
-            </w:tcBorders>
-          </w:tcPr>
-          <w:p>
-            <w:pPr>
-              <w:spacing w:before="0" w:after="60"/>
-              <w:keepNext/>
-              <w:jc w:val="center"/>
-            </w:pPr>
-            <w:r>
-              <w:rPr>
-                <w:rFonts w:ascii="Calibri" w:hAnsi="Calibri"/>
-                <w:sz w:val="20"/>
-              </w:rPr>
-              <w:t xml:space="default">8</w:t>
-            </w:r>
-          </w:p>
-        </w:tc>
-        <w:tc>
-          <w:tcPr>
-            <w:tcBorders>
-              <w:top w:val="single" w:space="0" w:color="D3D3D3"/>
-              <w:bottom w:val="single" w:space="0" w:color="D3D3D3"/>
-              <w:start w:val="single" w:space="0" w:color="D3D3D3"/>
-              <w:end w:val="single" w:space="0" w:color="D3D3D3"/>
-            </w:tcBorders>
-          </w:tcPr>
-          <w:p>
-            <w:pPr>
-              <w:spacing w:before="0" w:after="60"/>
-              <w:keepNext/>
-              <w:jc w:val="center"/>
-            </w:pPr>
-            <w:r>
-              <w:rPr>
-                <w:rFonts w:ascii="Calibri" w:hAnsi="Calibri"/>
-                <w:sz w:val="20"/>
-              </w:rPr>
-              <w:t xml:space="default">0.381</w:t>
-            </w:r>
-          </w:p>
-        </w:tc>
-        <w:tc>
-          <w:tcPr>
-            <w:tcBorders>
-              <w:top w:val="single" w:space="0" w:color="D3D3D3"/>
-              <w:bottom w:val="single" w:space="0" w:color="D3D3D3"/>
-              <w:start w:val="single" w:space="0" w:color="D3D3D3"/>
-              <w:end w:val="single" w:space="0" w:color="D3D3D3"/>
-            </w:tcBorders>
-          </w:tcPr>
-          <w:p>
-            <w:pPr>
-              <w:spacing w:before="0" w:after="60"/>
-              <w:keepNext/>
-              <w:jc w:val="center"/>
-            </w:pPr>
-            <w:r>
-              <w:rPr>
-                <w:rFonts w:ascii="Calibri" w:hAnsi="Calibri"/>
-                <w:sz w:val="20"/>
-              </w:rPr>
-              <w:t xml:space="default">13.1</w:t>
-            </w:r>
-          </w:p>
-        </w:tc>
-        <w:tc>
-          <w:tcPr>
-            <w:tcBorders>
-              <w:top w:val="single" w:space="0" w:color="D3D3D3"/>
-              <w:bottom w:val="single" w:space="0" w:color="D3D3D3"/>
-              <w:start w:val="single" w:space="0" w:color="D3D3D3"/>
-              <w:end w:val="single" w:space="0" w:color="D3D3D3"/>
-            </w:tcBorders>
-          </w:tcPr>
-          <w:p>
-            <w:pPr>
-              <w:spacing w:before="0" w:after="60"/>
-              <w:keepNext/>
-              <w:jc w:val="center"/>
-            </w:pPr>
-            <w:r>
-              <w:rPr>
-                <w:rFonts w:ascii="Calibri" w:hAnsi="Calibri"/>
-                <w:sz w:val="20"/>
-              </w:rPr>
-              <w:t xml:space="default">7.4</w:t>
-            </w:r>
-          </w:p>
-        </w:tc>
-        <w:tc>
-          <w:tcPr>
-            <w:tcBorders>
-              <w:top w:val="single" w:space="0" w:color="D3D3D3"/>
-              <w:bottom w:val="single" w:space="0" w:color="D3D3D3"/>
-              <w:start w:val="single" w:space="0" w:color="D3D3D3"/>
-              <w:end w:val="single" w:space="0" w:color="D3D3D3"/>
-            </w:tcBorders>
-          </w:tcPr>
-          <w:p>
-            <w:pPr>
-              <w:spacing w:before="0" w:after="60"/>
-              <w:keepNext/>
-              <w:jc w:val="center"/>
-            </w:pPr>
-            <w:r>
-              <w:rPr>
-                <w:rFonts w:ascii="Calibri" w:hAnsi="Calibri"/>
-                <w:sz w:val="20"/>
-              </w:rPr>
-              <w:t xml:space="default">0.571</w:t>
+              <w:t xml:space="default">6</w:t>
+            </w:r>
+          </w:p>
+        </w:tc>
+        <w:tc>
+          <w:tcPr>
+            <w:tcBorders>
+              <w:top w:val="single" w:space="0" w:color="D3D3D3"/>
+              <w:bottom w:val="single" w:space="0" w:color="D3D3D3"/>
+              <w:start w:val="single" w:space="0" w:color="D3D3D3"/>
+              <w:end w:val="single" w:space="0" w:color="D3D3D3"/>
+            </w:tcBorders>
+          </w:tcPr>
+          <w:p>
+            <w:pPr>
+              <w:spacing w:before="0" w:after="60"/>
+              <w:keepNext/>
+              <w:jc w:val="center"/>
+            </w:pPr>
+            <w:r>
+              <w:rPr>
+                <w:rFonts w:ascii="Calibri" w:hAnsi="Calibri"/>
+                <w:sz w:val="20"/>
+              </w:rPr>
+              <w:t xml:space="default">6</w:t>
+            </w:r>
+          </w:p>
+        </w:tc>
+        <w:tc>
+          <w:tcPr>
+            <w:tcBorders>
+              <w:top w:val="single" w:space="0" w:color="D3D3D3"/>
+              <w:bottom w:val="single" w:space="0" w:color="D3D3D3"/>
+              <w:start w:val="single" w:space="0" w:color="D3D3D3"/>
+              <w:end w:val="single" w:space="0" w:color="D3D3D3"/>
+            </w:tcBorders>
+          </w:tcPr>
+          <w:p>
+            <w:pPr>
+              <w:spacing w:before="0" w:after="60"/>
+              <w:keepNext/>
+              <w:jc w:val="center"/>
+            </w:pPr>
+            <w:r>
+              <w:rPr>
+                <w:rFonts w:ascii="Calibri" w:hAnsi="Calibri"/>
+                <w:sz w:val="20"/>
+              </w:rPr>
+              <w:t xml:space="default">0.400</w:t>
+            </w:r>
+          </w:p>
+        </w:tc>
+        <w:tc>
+          <w:tcPr>
+            <w:tcBorders>
+              <w:top w:val="single" w:space="0" w:color="D3D3D3"/>
+              <w:bottom w:val="single" w:space="0" w:color="D3D3D3"/>
+              <w:start w:val="single" w:space="0" w:color="D3D3D3"/>
+              <w:end w:val="single" w:space="0" w:color="D3D3D3"/>
+            </w:tcBorders>
+          </w:tcPr>
+          <w:p>
+            <w:pPr>
+              <w:spacing w:before="0" w:after="60"/>
+              <w:keepNext/>
+              <w:jc w:val="center"/>
+            </w:pPr>
+            <w:r>
+              <w:rPr>
+                <w:rFonts w:ascii="Calibri" w:hAnsi="Calibri"/>
+                <w:sz w:val="20"/>
+              </w:rPr>
+              <w:t xml:space="default">10.4</w:t>
+            </w:r>
+          </w:p>
+        </w:tc>
+        <w:tc>
+          <w:tcPr>
+            <w:tcBorders>
+              <w:top w:val="single" w:space="0" w:color="D3D3D3"/>
+              <w:bottom w:val="single" w:space="0" w:color="D3D3D3"/>
+              <w:start w:val="single" w:space="0" w:color="D3D3D3"/>
+              <w:end w:val="single" w:space="0" w:color="D3D3D3"/>
+            </w:tcBorders>
+          </w:tcPr>
+          <w:p>
+            <w:pPr>
+              <w:spacing w:before="0" w:after="60"/>
+              <w:keepNext/>
+              <w:jc w:val="center"/>
+            </w:pPr>
+            <w:r>
+              <w:rPr>
+                <w:rFonts w:ascii="Calibri" w:hAnsi="Calibri"/>
+                <w:sz w:val="20"/>
+              </w:rPr>
+              <w:t xml:space="default">5.6</w:t>
+            </w:r>
+          </w:p>
+        </w:tc>
+        <w:tc>
+          <w:tcPr>
+            <w:tcBorders>
+              <w:top w:val="single" w:space="0" w:color="D3D3D3"/>
+              <w:bottom w:val="single" w:space="0" w:color="D3D3D3"/>
+              <w:start w:val="single" w:space="0" w:color="D3D3D3"/>
+              <w:end w:val="single" w:space="0" w:color="D3D3D3"/>
+            </w:tcBorders>
+          </w:tcPr>
+          <w:p>
+            <w:pPr>
+              <w:spacing w:before="0" w:after="60"/>
+              <w:keepNext/>
+              <w:jc w:val="center"/>
+            </w:pPr>
+            <w:r>
+              <w:rPr>
+                <w:rFonts w:ascii="Calibri" w:hAnsi="Calibri"/>
+                <w:sz w:val="20"/>
+              </w:rPr>
+              <w:t xml:space="default">0.556</w:t>
             </w:r>
           </w:p>
         </w:tc>
@@ -746,127 +746,127 @@
                 <w:rFonts w:ascii="Calibri" w:hAnsi="Calibri"/>
                 <w:sz w:val="20"/>
               </w:rPr>
-              <w:t xml:space="default">4</w:t>
-            </w:r>
-          </w:p>
-        </w:tc>
-        <w:tc>
-          <w:tcPr>
-            <w:tcBorders>
-              <w:top w:val="single" w:space="0" w:color="D3D3D3"/>
-              <w:bottom w:val="single" w:space="0" w:color="D3D3D3"/>
-              <w:start w:val="single" w:space="0" w:color="D3D3D3"/>
-              <w:end w:val="single" w:space="0" w:color="D3D3D3"/>
-            </w:tcBorders>
-          </w:tcPr>
-          <w:p>
-            <w:pPr>
-              <w:spacing w:before="0" w:after="60"/>
-              <w:keepNext/>
-              <w:jc w:val="center"/>
-            </w:pPr>
-            <w:r>
-              <w:rPr>
-                <w:rFonts w:ascii="Calibri" w:hAnsi="Calibri"/>
-                <w:sz w:val="20"/>
-              </w:rPr>
-              <w:t xml:space="default">5</w:t>
-            </w:r>
-          </w:p>
-        </w:tc>
-        <w:tc>
-          <w:tcPr>
-            <w:tcBorders>
-              <w:top w:val="single" w:space="0" w:color="D3D3D3"/>
-              <w:bottom w:val="single" w:space="0" w:color="D3D3D3"/>
-              <w:start w:val="single" w:space="0" w:color="D3D3D3"/>
-              <w:end w:val="single" w:space="0" w:color="D3D3D3"/>
-            </w:tcBorders>
-          </w:tcPr>
-          <w:p>
-            <w:pPr>
-              <w:spacing w:before="0" w:after="60"/>
-              <w:keepNext/>
-              <w:jc w:val="center"/>
-            </w:pPr>
-            <w:r>
-              <w:rPr>
-                <w:rFonts w:ascii="Calibri" w:hAnsi="Calibri"/>
-                <w:sz w:val="20"/>
-              </w:rPr>
-              <w:t xml:space="default">0.833</w:t>
-            </w:r>
-          </w:p>
-        </w:tc>
-        <w:tc>
-          <w:tcPr>
-            <w:tcBorders>
-              <w:top w:val="single" w:space="0" w:color="D3D3D3"/>
-              <w:bottom w:val="single" w:space="0" w:color="D3D3D3"/>
-              <w:start w:val="single" w:space="0" w:color="D3D3D3"/>
-              <w:end w:val="single" w:space="0" w:color="D3D3D3"/>
-            </w:tcBorders>
-          </w:tcPr>
-          <w:p>
-            <w:pPr>
-              <w:spacing w:before="0" w:after="60"/>
-              <w:keepNext/>
-              <w:jc w:val="center"/>
-            </w:pPr>
-            <w:r>
-              <w:rPr>
-                <w:rFonts w:ascii="Calibri" w:hAnsi="Calibri"/>
-                <w:sz w:val="20"/>
-              </w:rPr>
-              <w:t xml:space="default">14.4</w:t>
-            </w:r>
-          </w:p>
-        </w:tc>
-        <w:tc>
-          <w:tcPr>
-            <w:tcBorders>
-              <w:top w:val="single" w:space="0" w:color="D3D3D3"/>
-              <w:bottom w:val="single" w:space="0" w:color="D3D3D3"/>
-              <w:start w:val="single" w:space="0" w:color="D3D3D3"/>
-              <w:end w:val="single" w:space="0" w:color="D3D3D3"/>
-            </w:tcBorders>
-          </w:tcPr>
-          <w:p>
-            <w:pPr>
-              <w:spacing w:before="0" w:after="60"/>
-              <w:keepNext/>
-              <w:jc w:val="center"/>
-            </w:pPr>
-            <w:r>
-              <w:rPr>
-                <w:rFonts w:ascii="Calibri" w:hAnsi="Calibri"/>
-                <w:sz w:val="20"/>
-              </w:rPr>
-              <w:t xml:space="default">8.1</w:t>
-            </w:r>
-          </w:p>
-        </w:tc>
-        <w:tc>
-          <w:tcPr>
-            <w:tcBorders>
-              <w:top w:val="single" w:space="0" w:color="D3D3D3"/>
-              <w:bottom w:val="single" w:space="0" w:color="D3D3D3"/>
-              <w:start w:val="single" w:space="0" w:color="D3D3D3"/>
-              <w:end w:val="single" w:space="0" w:color="D3D3D3"/>
-            </w:tcBorders>
-          </w:tcPr>
-          <w:p>
-            <w:pPr>
-              <w:spacing w:before="0" w:after="60"/>
-              <w:keepNext/>
-              <w:jc w:val="center"/>
-            </w:pPr>
-            <w:r>
-              <w:rPr>
-                <w:rFonts w:ascii="Calibri" w:hAnsi="Calibri"/>
-                <w:sz w:val="20"/>
-              </w:rPr>
-              <w:t xml:space="default">0.833</w:t>
+              <w:t xml:space="default">3</w:t>
+            </w:r>
+          </w:p>
+        </w:tc>
+        <w:tc>
+          <w:tcPr>
+            <w:tcBorders>
+              <w:top w:val="single" w:space="0" w:color="D3D3D3"/>
+              <w:bottom w:val="single" w:space="0" w:color="D3D3D3"/>
+              <w:start w:val="single" w:space="0" w:color="D3D3D3"/>
+              <w:end w:val="single" w:space="0" w:color="D3D3D3"/>
+            </w:tcBorders>
+          </w:tcPr>
+          <w:p>
+            <w:pPr>
+              <w:spacing w:before="0" w:after="60"/>
+              <w:keepNext/>
+              <w:jc w:val="center"/>
+            </w:pPr>
+            <w:r>
+              <w:rPr>
+                <w:rFonts w:ascii="Calibri" w:hAnsi="Calibri"/>
+                <w:sz w:val="20"/>
+              </w:rPr>
+              <w:t xml:space="default">3</w:t>
+            </w:r>
+          </w:p>
+        </w:tc>
+        <w:tc>
+          <w:tcPr>
+            <w:tcBorders>
+              <w:top w:val="single" w:space="0" w:color="D3D3D3"/>
+              <w:bottom w:val="single" w:space="0" w:color="D3D3D3"/>
+              <w:start w:val="single" w:space="0" w:color="D3D3D3"/>
+              <w:end w:val="single" w:space="0" w:color="D3D3D3"/>
+            </w:tcBorders>
+          </w:tcPr>
+          <w:p>
+            <w:pPr>
+              <w:spacing w:before="0" w:after="60"/>
+              <w:keepNext/>
+              <w:jc w:val="center"/>
+            </w:pPr>
+            <w:r>
+              <w:rPr>
+                <w:rFonts w:ascii="Calibri" w:hAnsi="Calibri"/>
+                <w:sz w:val="20"/>
+              </w:rPr>
+              <w:t xml:space="default">1.000</w:t>
+            </w:r>
+          </w:p>
+        </w:tc>
+        <w:tc>
+          <w:tcPr>
+            <w:tcBorders>
+              <w:top w:val="single" w:space="0" w:color="D3D3D3"/>
+              <w:bottom w:val="single" w:space="0" w:color="D3D3D3"/>
+              <w:start w:val="single" w:space="0" w:color="D3D3D3"/>
+              <w:end w:val="single" w:space="0" w:color="D3D3D3"/>
+            </w:tcBorders>
+          </w:tcPr>
+          <w:p>
+            <w:pPr>
+              <w:spacing w:before="0" w:after="60"/>
+              <w:keepNext/>
+              <w:jc w:val="center"/>
+            </w:pPr>
+            <w:r>
+              <w:rPr>
+                <w:rFonts w:ascii="Calibri" w:hAnsi="Calibri"/>
+                <w:sz w:val="20"/>
+              </w:rPr>
+              <w:t xml:space="default">3.3</w:t>
+            </w:r>
+          </w:p>
+        </w:tc>
+        <w:tc>
+          <w:tcPr>
+            <w:tcBorders>
+              <w:top w:val="single" w:space="0" w:color="D3D3D3"/>
+              <w:bottom w:val="single" w:space="0" w:color="D3D3D3"/>
+              <w:start w:val="single" w:space="0" w:color="D3D3D3"/>
+              <w:end w:val="single" w:space="0" w:color="D3D3D3"/>
+            </w:tcBorders>
+          </w:tcPr>
+          <w:p>
+            <w:pPr>
+              <w:spacing w:before="0" w:after="60"/>
+              <w:keepNext/>
+              <w:jc w:val="center"/>
+            </w:pPr>
+            <w:r>
+              <w:rPr>
+                <w:rFonts w:ascii="Calibri" w:hAnsi="Calibri"/>
+                <w:sz w:val="20"/>
+              </w:rPr>
+              <w:t xml:space="default">2.8</w:t>
+            </w:r>
+          </w:p>
+        </w:tc>
+        <w:tc>
+          <w:tcPr>
+            <w:tcBorders>
+              <w:top w:val="single" w:space="0" w:color="D3D3D3"/>
+              <w:bottom w:val="single" w:space="0" w:color="D3D3D3"/>
+              <w:start w:val="single" w:space="0" w:color="D3D3D3"/>
+              <w:end w:val="single" w:space="0" w:color="D3D3D3"/>
+            </w:tcBorders>
+          </w:tcPr>
+          <w:p>
+            <w:pPr>
+              <w:spacing w:before="0" w:after="60"/>
+              <w:keepNext/>
+              <w:jc w:val="center"/>
+            </w:pPr>
+            <w:r>
+              <w:rPr>
+                <w:rFonts w:ascii="Calibri" w:hAnsi="Calibri"/>
+                <w:sz w:val="20"/>
+              </w:rPr>
+              <w:t xml:space="default">1.000</w:t>
             </w:r>
           </w:p>
         </w:tc>
@@ -943,127 +943,127 @@
                 <w:rFonts w:ascii="Calibri" w:hAnsi="Calibri"/>
                 <w:sz w:val="20"/>
               </w:rPr>
-              <w:t xml:space="default">7</w:t>
-            </w:r>
-          </w:p>
-        </w:tc>
-        <w:tc>
-          <w:tcPr>
-            <w:tcBorders>
-              <w:top w:val="single" w:space="0" w:color="D3D3D3"/>
-              <w:bottom w:val="single" w:space="0" w:color="D3D3D3"/>
-              <w:start w:val="single" w:space="0" w:color="D3D3D3"/>
-              <w:end w:val="single" w:space="0" w:color="D3D3D3"/>
-            </w:tcBorders>
-          </w:tcPr>
-          <w:p>
-            <w:pPr>
-              <w:spacing w:before="0" w:after="60"/>
-              <w:keepNext/>
-              <w:jc w:val="center"/>
-            </w:pPr>
-            <w:r>
-              <w:rPr>
-                <w:rFonts w:ascii="Calibri" w:hAnsi="Calibri"/>
-                <w:sz w:val="20"/>
-              </w:rPr>
-              <w:t xml:space="default">8</w:t>
-            </w:r>
-          </w:p>
-        </w:tc>
-        <w:tc>
-          <w:tcPr>
-            <w:tcBorders>
-              <w:top w:val="single" w:space="0" w:color="D3D3D3"/>
-              <w:bottom w:val="single" w:space="0" w:color="D3D3D3"/>
-              <w:start w:val="single" w:space="0" w:color="D3D3D3"/>
-              <w:end w:val="single" w:space="0" w:color="D3D3D3"/>
-            </w:tcBorders>
-          </w:tcPr>
-          <w:p>
-            <w:pPr>
-              <w:spacing w:before="0" w:after="60"/>
-              <w:keepNext/>
-              <w:jc w:val="center"/>
-            </w:pPr>
-            <w:r>
-              <w:rPr>
-                <w:rFonts w:ascii="Calibri" w:hAnsi="Calibri"/>
-                <w:sz w:val="20"/>
-              </w:rPr>
-              <w:t xml:space="default">0.381</w:t>
-            </w:r>
-          </w:p>
-        </w:tc>
-        <w:tc>
-          <w:tcPr>
-            <w:tcBorders>
-              <w:top w:val="single" w:space="0" w:color="D3D3D3"/>
-              <w:bottom w:val="single" w:space="0" w:color="D3D3D3"/>
-              <w:start w:val="single" w:space="0" w:color="D3D3D3"/>
-              <w:end w:val="single" w:space="0" w:color="D3D3D3"/>
-            </w:tcBorders>
-          </w:tcPr>
-          <w:p>
-            <w:pPr>
-              <w:spacing w:before="0" w:after="60"/>
-              <w:keepNext/>
-              <w:jc w:val="center"/>
-            </w:pPr>
-            <w:r>
-              <w:rPr>
-                <w:rFonts w:ascii="Calibri" w:hAnsi="Calibri"/>
-                <w:sz w:val="20"/>
-              </w:rPr>
-              <w:t xml:space="default">15.1</w:t>
-            </w:r>
-          </w:p>
-        </w:tc>
-        <w:tc>
-          <w:tcPr>
-            <w:tcBorders>
-              <w:top w:val="single" w:space="0" w:color="D3D3D3"/>
-              <w:bottom w:val="single" w:space="0" w:color="D3D3D3"/>
-              <w:start w:val="single" w:space="0" w:color="D3D3D3"/>
-              <w:end w:val="single" w:space="0" w:color="D3D3D3"/>
-            </w:tcBorders>
-          </w:tcPr>
-          <w:p>
-            <w:pPr>
-              <w:spacing w:before="0" w:after="60"/>
-              <w:keepNext/>
-              <w:jc w:val="center"/>
-            </w:pPr>
-            <w:r>
-              <w:rPr>
-                <w:rFonts w:ascii="Calibri" w:hAnsi="Calibri"/>
-                <w:sz w:val="20"/>
-              </w:rPr>
-              <w:t xml:space="default">8.0</w:t>
-            </w:r>
-          </w:p>
-        </w:tc>
-        <w:tc>
-          <w:tcPr>
-            <w:tcBorders>
-              <w:top w:val="single" w:space="0" w:color="D3D3D3"/>
-              <w:bottom w:val="single" w:space="0" w:color="D3D3D3"/>
-              <w:start w:val="single" w:space="0" w:color="D3D3D3"/>
-              <w:end w:val="single" w:space="0" w:color="D3D3D3"/>
-            </w:tcBorders>
-          </w:tcPr>
-          <w:p>
-            <w:pPr>
-              <w:spacing w:before="0" w:after="60"/>
-              <w:keepNext/>
-              <w:jc w:val="center"/>
-            </w:pPr>
-            <w:r>
-              <w:rPr>
-                <w:rFonts w:ascii="Calibri" w:hAnsi="Calibri"/>
-                <w:sz w:val="20"/>
-              </w:rPr>
-              <w:t xml:space="default">0.571</w:t>
+              <w:t xml:space="default">6</w:t>
+            </w:r>
+          </w:p>
+        </w:tc>
+        <w:tc>
+          <w:tcPr>
+            <w:tcBorders>
+              <w:top w:val="single" w:space="0" w:color="D3D3D3"/>
+              <w:bottom w:val="single" w:space="0" w:color="D3D3D3"/>
+              <w:start w:val="single" w:space="0" w:color="D3D3D3"/>
+              <w:end w:val="single" w:space="0" w:color="D3D3D3"/>
+            </w:tcBorders>
+          </w:tcPr>
+          <w:p>
+            <w:pPr>
+              <w:spacing w:before="0" w:after="60"/>
+              <w:keepNext/>
+              <w:jc w:val="center"/>
+            </w:pPr>
+            <w:r>
+              <w:rPr>
+                <w:rFonts w:ascii="Calibri" w:hAnsi="Calibri"/>
+                <w:sz w:val="20"/>
+              </w:rPr>
+              <w:t xml:space="default">6</w:t>
+            </w:r>
+          </w:p>
+        </w:tc>
+        <w:tc>
+          <w:tcPr>
+            <w:tcBorders>
+              <w:top w:val="single" w:space="0" w:color="D3D3D3"/>
+              <w:bottom w:val="single" w:space="0" w:color="D3D3D3"/>
+              <w:start w:val="single" w:space="0" w:color="D3D3D3"/>
+              <w:end w:val="single" w:space="0" w:color="D3D3D3"/>
+            </w:tcBorders>
+          </w:tcPr>
+          <w:p>
+            <w:pPr>
+              <w:spacing w:before="0" w:after="60"/>
+              <w:keepNext/>
+              <w:jc w:val="center"/>
+            </w:pPr>
+            <w:r>
+              <w:rPr>
+                <w:rFonts w:ascii="Calibri" w:hAnsi="Calibri"/>
+                <w:sz w:val="20"/>
+              </w:rPr>
+              <w:t xml:space="default">0.400</w:t>
+            </w:r>
+          </w:p>
+        </w:tc>
+        <w:tc>
+          <w:tcPr>
+            <w:tcBorders>
+              <w:top w:val="single" w:space="0" w:color="D3D3D3"/>
+              <w:bottom w:val="single" w:space="0" w:color="D3D3D3"/>
+              <w:start w:val="single" w:space="0" w:color="D3D3D3"/>
+              <w:end w:val="single" w:space="0" w:color="D3D3D3"/>
+            </w:tcBorders>
+          </w:tcPr>
+          <w:p>
+            <w:pPr>
+              <w:spacing w:before="0" w:after="60"/>
+              <w:keepNext/>
+              <w:jc w:val="center"/>
+            </w:pPr>
+            <w:r>
+              <w:rPr>
+                <w:rFonts w:ascii="Calibri" w:hAnsi="Calibri"/>
+                <w:sz w:val="20"/>
+              </w:rPr>
+              <w:t xml:space="default">11.5</w:t>
+            </w:r>
+          </w:p>
+        </w:tc>
+        <w:tc>
+          <w:tcPr>
+            <w:tcBorders>
+              <w:top w:val="single" w:space="0" w:color="D3D3D3"/>
+              <w:bottom w:val="single" w:space="0" w:color="D3D3D3"/>
+              <w:start w:val="single" w:space="0" w:color="D3D3D3"/>
+              <w:end w:val="single" w:space="0" w:color="D3D3D3"/>
+            </w:tcBorders>
+          </w:tcPr>
+          <w:p>
+            <w:pPr>
+              <w:spacing w:before="0" w:after="60"/>
+              <w:keepNext/>
+              <w:jc w:val="center"/>
+            </w:pPr>
+            <w:r>
+              <w:rPr>
+                <w:rFonts w:ascii="Calibri" w:hAnsi="Calibri"/>
+                <w:sz w:val="20"/>
+              </w:rPr>
+              <w:t xml:space="default">6.1</w:t>
+            </w:r>
+          </w:p>
+        </w:tc>
+        <w:tc>
+          <w:tcPr>
+            <w:tcBorders>
+              <w:top w:val="single" w:space="0" w:color="D3D3D3"/>
+              <w:bottom w:val="single" w:space="0" w:color="D3D3D3"/>
+              <w:start w:val="single" w:space="0" w:color="D3D3D3"/>
+              <w:end w:val="single" w:space="0" w:color="D3D3D3"/>
+            </w:tcBorders>
+          </w:tcPr>
+          <w:p>
+            <w:pPr>
+              <w:spacing w:before="0" w:after="60"/>
+              <w:keepNext/>
+              <w:jc w:val="center"/>
+            </w:pPr>
+            <w:r>
+              <w:rPr>
+                <w:rFonts w:ascii="Calibri" w:hAnsi="Calibri"/>
+                <w:sz w:val="20"/>
+              </w:rPr>
+              <w:t xml:space="default">0.556</w:t>
             </w:r>
           </w:p>
         </w:tc>
@@ -1140,127 +1140,127 @@
                 <w:rFonts w:ascii="Calibri" w:hAnsi="Calibri"/>
                 <w:sz w:val="20"/>
               </w:rPr>
-              <w:t xml:space="default">4</w:t>
-            </w:r>
-          </w:p>
-        </w:tc>
-        <w:tc>
-          <w:tcPr>
-            <w:tcBorders>
-              <w:top w:val="single" w:space="0" w:color="D3D3D3"/>
-              <w:bottom w:val="single" w:space="0" w:color="D3D3D3"/>
-              <w:start w:val="single" w:space="0" w:color="D3D3D3"/>
-              <w:end w:val="single" w:space="0" w:color="D3D3D3"/>
-            </w:tcBorders>
-          </w:tcPr>
-          <w:p>
-            <w:pPr>
-              <w:spacing w:before="0" w:after="60"/>
-              <w:keepNext/>
-              <w:jc w:val="center"/>
-            </w:pPr>
-            <w:r>
-              <w:rPr>
-                <w:rFonts w:ascii="Calibri" w:hAnsi="Calibri"/>
-                <w:sz w:val="20"/>
-              </w:rPr>
-              <w:t xml:space="default">5</w:t>
-            </w:r>
-          </w:p>
-        </w:tc>
-        <w:tc>
-          <w:tcPr>
-            <w:tcBorders>
-              <w:top w:val="single" w:space="0" w:color="D3D3D3"/>
-              <w:bottom w:val="single" w:space="0" w:color="D3D3D3"/>
-              <w:start w:val="single" w:space="0" w:color="D3D3D3"/>
-              <w:end w:val="single" w:space="0" w:color="D3D3D3"/>
-            </w:tcBorders>
-          </w:tcPr>
-          <w:p>
-            <w:pPr>
-              <w:spacing w:before="0" w:after="60"/>
-              <w:keepNext/>
-              <w:jc w:val="center"/>
-            </w:pPr>
-            <w:r>
-              <w:rPr>
-                <w:rFonts w:ascii="Calibri" w:hAnsi="Calibri"/>
-                <w:sz w:val="20"/>
-              </w:rPr>
-              <w:t xml:space="default">0.833</w:t>
-            </w:r>
-          </w:p>
-        </w:tc>
-        <w:tc>
-          <w:tcPr>
-            <w:tcBorders>
-              <w:top w:val="single" w:space="0" w:color="D3D3D3"/>
-              <w:bottom w:val="single" w:space="0" w:color="D3D3D3"/>
-              <w:start w:val="single" w:space="0" w:color="D3D3D3"/>
-              <w:end w:val="single" w:space="0" w:color="D3D3D3"/>
-            </w:tcBorders>
-          </w:tcPr>
-          <w:p>
-            <w:pPr>
-              <w:spacing w:before="0" w:after="60"/>
-              <w:keepNext/>
-              <w:jc w:val="center"/>
-            </w:pPr>
-            <w:r>
-              <w:rPr>
-                <w:rFonts w:ascii="Calibri" w:hAnsi="Calibri"/>
-                <w:sz w:val="20"/>
-              </w:rPr>
-              <w:t xml:space="default">13.8</w:t>
-            </w:r>
-          </w:p>
-        </w:tc>
-        <w:tc>
-          <w:tcPr>
-            <w:tcBorders>
-              <w:top w:val="single" w:space="0" w:color="D3D3D3"/>
-              <w:bottom w:val="single" w:space="0" w:color="D3D3D3"/>
-              <w:start w:val="single" w:space="0" w:color="D3D3D3"/>
-              <w:end w:val="single" w:space="0" w:color="D3D3D3"/>
-            </w:tcBorders>
-          </w:tcPr>
-          <w:p>
-            <w:pPr>
-              <w:spacing w:before="0" w:after="60"/>
-              <w:keepNext/>
-              <w:jc w:val="center"/>
-            </w:pPr>
-            <w:r>
-              <w:rPr>
-                <w:rFonts w:ascii="Calibri" w:hAnsi="Calibri"/>
-                <w:sz w:val="20"/>
-              </w:rPr>
-              <w:t xml:space="default">7.7</w:t>
-            </w:r>
-          </w:p>
-        </w:tc>
-        <w:tc>
-          <w:tcPr>
-            <w:tcBorders>
-              <w:top w:val="single" w:space="0" w:color="D3D3D3"/>
-              <w:bottom w:val="single" w:space="0" w:color="D3D3D3"/>
-              <w:start w:val="single" w:space="0" w:color="D3D3D3"/>
-              <w:end w:val="single" w:space="0" w:color="D3D3D3"/>
-            </w:tcBorders>
-          </w:tcPr>
-          <w:p>
-            <w:pPr>
-              <w:spacing w:before="0" w:after="60"/>
-              <w:keepNext/>
-              <w:jc w:val="center"/>
-            </w:pPr>
-            <w:r>
-              <w:rPr>
-                <w:rFonts w:ascii="Calibri" w:hAnsi="Calibri"/>
-                <w:sz w:val="20"/>
-              </w:rPr>
-              <w:t xml:space="default">0.833</w:t>
+              <w:t xml:space="default">3</w:t>
+            </w:r>
+          </w:p>
+        </w:tc>
+        <w:tc>
+          <w:tcPr>
+            <w:tcBorders>
+              <w:top w:val="single" w:space="0" w:color="D3D3D3"/>
+              <w:bottom w:val="single" w:space="0" w:color="D3D3D3"/>
+              <w:start w:val="single" w:space="0" w:color="D3D3D3"/>
+              <w:end w:val="single" w:space="0" w:color="D3D3D3"/>
+            </w:tcBorders>
+          </w:tcPr>
+          <w:p>
+            <w:pPr>
+              <w:spacing w:before="0" w:after="60"/>
+              <w:keepNext/>
+              <w:jc w:val="center"/>
+            </w:pPr>
+            <w:r>
+              <w:rPr>
+                <w:rFonts w:ascii="Calibri" w:hAnsi="Calibri"/>
+                <w:sz w:val="20"/>
+              </w:rPr>
+              <w:t xml:space="default">3</w:t>
+            </w:r>
+          </w:p>
+        </w:tc>
+        <w:tc>
+          <w:tcPr>
+            <w:tcBorders>
+              <w:top w:val="single" w:space="0" w:color="D3D3D3"/>
+              <w:bottom w:val="single" w:space="0" w:color="D3D3D3"/>
+              <w:start w:val="single" w:space="0" w:color="D3D3D3"/>
+              <w:end w:val="single" w:space="0" w:color="D3D3D3"/>
+            </w:tcBorders>
+          </w:tcPr>
+          <w:p>
+            <w:pPr>
+              <w:spacing w:before="0" w:after="60"/>
+              <w:keepNext/>
+              <w:jc w:val="center"/>
+            </w:pPr>
+            <w:r>
+              <w:rPr>
+                <w:rFonts w:ascii="Calibri" w:hAnsi="Calibri"/>
+                <w:sz w:val="20"/>
+              </w:rPr>
+              <w:t xml:space="default">1.000</w:t>
+            </w:r>
+          </w:p>
+        </w:tc>
+        <w:tc>
+          <w:tcPr>
+            <w:tcBorders>
+              <w:top w:val="single" w:space="0" w:color="D3D3D3"/>
+              <w:bottom w:val="single" w:space="0" w:color="D3D3D3"/>
+              <w:start w:val="single" w:space="0" w:color="D3D3D3"/>
+              <w:end w:val="single" w:space="0" w:color="D3D3D3"/>
+            </w:tcBorders>
+          </w:tcPr>
+          <w:p>
+            <w:pPr>
+              <w:spacing w:before="0" w:after="60"/>
+              <w:keepNext/>
+              <w:jc w:val="center"/>
+            </w:pPr>
+            <w:r>
+              <w:rPr>
+                <w:rFonts w:ascii="Calibri" w:hAnsi="Calibri"/>
+                <w:sz w:val="20"/>
+              </w:rPr>
+              <w:t xml:space="default">3.4</w:t>
+            </w:r>
+          </w:p>
+        </w:tc>
+        <w:tc>
+          <w:tcPr>
+            <w:tcBorders>
+              <w:top w:val="single" w:space="0" w:color="D3D3D3"/>
+              <w:bottom w:val="single" w:space="0" w:color="D3D3D3"/>
+              <w:start w:val="single" w:space="0" w:color="D3D3D3"/>
+              <w:end w:val="single" w:space="0" w:color="D3D3D3"/>
+            </w:tcBorders>
+          </w:tcPr>
+          <w:p>
+            <w:pPr>
+              <w:spacing w:before="0" w:after="60"/>
+              <w:keepNext/>
+              <w:jc w:val="center"/>
+            </w:pPr>
+            <w:r>
+              <w:rPr>
+                <w:rFonts w:ascii="Calibri" w:hAnsi="Calibri"/>
+                <w:sz w:val="20"/>
+              </w:rPr>
+              <w:t xml:space="default">2.8</w:t>
+            </w:r>
+          </w:p>
+        </w:tc>
+        <w:tc>
+          <w:tcPr>
+            <w:tcBorders>
+              <w:top w:val="single" w:space="0" w:color="D3D3D3"/>
+              <w:bottom w:val="single" w:space="0" w:color="D3D3D3"/>
+              <w:start w:val="single" w:space="0" w:color="D3D3D3"/>
+              <w:end w:val="single" w:space="0" w:color="D3D3D3"/>
+            </w:tcBorders>
+          </w:tcPr>
+          <w:p>
+            <w:pPr>
+              <w:spacing w:before="0" w:after="60"/>
+              <w:keepNext/>
+              <w:jc w:val="center"/>
+            </w:pPr>
+            <w:r>
+              <w:rPr>
+                <w:rFonts w:ascii="Calibri" w:hAnsi="Calibri"/>
+                <w:sz w:val="20"/>
+              </w:rPr>
+              <w:t xml:space="default">1.000</w:t>
             </w:r>
           </w:p>
         </w:tc>
@@ -1337,127 +1337,127 @@
                 <w:rFonts w:ascii="Calibri" w:hAnsi="Calibri"/>
                 <w:sz w:val="20"/>
               </w:rPr>
-              <w:t xml:space="default">7</w:t>
-            </w:r>
-          </w:p>
-        </w:tc>
-        <w:tc>
-          <w:tcPr>
-            <w:tcBorders>
-              <w:top w:val="single" w:space="0" w:color="D3D3D3"/>
-              <w:bottom w:val="single" w:space="0" w:color="D3D3D3"/>
-              <w:start w:val="single" w:space="0" w:color="D3D3D3"/>
-              <w:end w:val="single" w:space="0" w:color="D3D3D3"/>
-            </w:tcBorders>
-          </w:tcPr>
-          <w:p>
-            <w:pPr>
-              <w:spacing w:before="0" w:after="60"/>
-              <w:keepNext/>
-              <w:jc w:val="center"/>
-            </w:pPr>
-            <w:r>
-              <w:rPr>
-                <w:rFonts w:ascii="Calibri" w:hAnsi="Calibri"/>
-                <w:sz w:val="20"/>
-              </w:rPr>
-              <w:t xml:space="default">8</w:t>
-            </w:r>
-          </w:p>
-        </w:tc>
-        <w:tc>
-          <w:tcPr>
-            <w:tcBorders>
-              <w:top w:val="single" w:space="0" w:color="D3D3D3"/>
-              <w:bottom w:val="single" w:space="0" w:color="D3D3D3"/>
-              <w:start w:val="single" w:space="0" w:color="D3D3D3"/>
-              <w:end w:val="single" w:space="0" w:color="D3D3D3"/>
-            </w:tcBorders>
-          </w:tcPr>
-          <w:p>
-            <w:pPr>
-              <w:spacing w:before="0" w:after="60"/>
-              <w:keepNext/>
-              <w:jc w:val="center"/>
-            </w:pPr>
-            <w:r>
-              <w:rPr>
-                <w:rFonts w:ascii="Calibri" w:hAnsi="Calibri"/>
-                <w:sz w:val="20"/>
-              </w:rPr>
-              <w:t xml:space="default">0.381</w:t>
-            </w:r>
-          </w:p>
-        </w:tc>
-        <w:tc>
-          <w:tcPr>
-            <w:tcBorders>
-              <w:top w:val="single" w:space="0" w:color="D3D3D3"/>
-              <w:bottom w:val="single" w:space="0" w:color="D3D3D3"/>
-              <w:start w:val="single" w:space="0" w:color="D3D3D3"/>
-              <w:end w:val="single" w:space="0" w:color="D3D3D3"/>
-            </w:tcBorders>
-          </w:tcPr>
-          <w:p>
-            <w:pPr>
-              <w:spacing w:before="0" w:after="60"/>
-              <w:keepNext/>
-              <w:jc w:val="center"/>
-            </w:pPr>
-            <w:r>
-              <w:rPr>
-                <w:rFonts w:ascii="Calibri" w:hAnsi="Calibri"/>
-                <w:sz w:val="20"/>
-              </w:rPr>
-              <w:t xml:space="default">14.6</w:t>
-            </w:r>
-          </w:p>
-        </w:tc>
-        <w:tc>
-          <w:tcPr>
-            <w:tcBorders>
-              <w:top w:val="single" w:space="0" w:color="D3D3D3"/>
-              <w:bottom w:val="single" w:space="0" w:color="D3D3D3"/>
-              <w:start w:val="single" w:space="0" w:color="D3D3D3"/>
-              <w:end w:val="single" w:space="0" w:color="D3D3D3"/>
-            </w:tcBorders>
-          </w:tcPr>
-          <w:p>
-            <w:pPr>
-              <w:spacing w:before="0" w:after="60"/>
-              <w:keepNext/>
-              <w:jc w:val="center"/>
-            </w:pPr>
-            <w:r>
-              <w:rPr>
-                <w:rFonts w:ascii="Calibri" w:hAnsi="Calibri"/>
-                <w:sz w:val="20"/>
-              </w:rPr>
-              <w:t xml:space="default">7.8</w:t>
-            </w:r>
-          </w:p>
-        </w:tc>
-        <w:tc>
-          <w:tcPr>
-            <w:tcBorders>
-              <w:top w:val="single" w:space="0" w:color="D3D3D3"/>
-              <w:bottom w:val="single" w:space="0" w:color="D3D3D3"/>
-              <w:start w:val="single" w:space="0" w:color="D3D3D3"/>
-              <w:end w:val="single" w:space="0" w:color="D3D3D3"/>
-            </w:tcBorders>
-          </w:tcPr>
-          <w:p>
-            <w:pPr>
-              <w:spacing w:before="0" w:after="60"/>
-              <w:keepNext/>
-              <w:jc w:val="center"/>
-            </w:pPr>
-            <w:r>
-              <w:rPr>
-                <w:rFonts w:ascii="Calibri" w:hAnsi="Calibri"/>
-                <w:sz w:val="20"/>
-              </w:rPr>
-              <w:t xml:space="default">0.571</w:t>
+              <w:t xml:space="default">6</w:t>
+            </w:r>
+          </w:p>
+        </w:tc>
+        <w:tc>
+          <w:tcPr>
+            <w:tcBorders>
+              <w:top w:val="single" w:space="0" w:color="D3D3D3"/>
+              <w:bottom w:val="single" w:space="0" w:color="D3D3D3"/>
+              <w:start w:val="single" w:space="0" w:color="D3D3D3"/>
+              <w:end w:val="single" w:space="0" w:color="D3D3D3"/>
+            </w:tcBorders>
+          </w:tcPr>
+          <w:p>
+            <w:pPr>
+              <w:spacing w:before="0" w:after="60"/>
+              <w:keepNext/>
+              <w:jc w:val="center"/>
+            </w:pPr>
+            <w:r>
+              <w:rPr>
+                <w:rFonts w:ascii="Calibri" w:hAnsi="Calibri"/>
+                <w:sz w:val="20"/>
+              </w:rPr>
+              <w:t xml:space="default">6</w:t>
+            </w:r>
+          </w:p>
+        </w:tc>
+        <w:tc>
+          <w:tcPr>
+            <w:tcBorders>
+              <w:top w:val="single" w:space="0" w:color="D3D3D3"/>
+              <w:bottom w:val="single" w:space="0" w:color="D3D3D3"/>
+              <w:start w:val="single" w:space="0" w:color="D3D3D3"/>
+              <w:end w:val="single" w:space="0" w:color="D3D3D3"/>
+            </w:tcBorders>
+          </w:tcPr>
+          <w:p>
+            <w:pPr>
+              <w:spacing w:before="0" w:after="60"/>
+              <w:keepNext/>
+              <w:jc w:val="center"/>
+            </w:pPr>
+            <w:r>
+              <w:rPr>
+                <w:rFonts w:ascii="Calibri" w:hAnsi="Calibri"/>
+                <w:sz w:val="20"/>
+              </w:rPr>
+              <w:t xml:space="default">0.400</w:t>
+            </w:r>
+          </w:p>
+        </w:tc>
+        <w:tc>
+          <w:tcPr>
+            <w:tcBorders>
+              <w:top w:val="single" w:space="0" w:color="D3D3D3"/>
+              <w:bottom w:val="single" w:space="0" w:color="D3D3D3"/>
+              <w:start w:val="single" w:space="0" w:color="D3D3D3"/>
+              <w:end w:val="single" w:space="0" w:color="D3D3D3"/>
+            </w:tcBorders>
+          </w:tcPr>
+          <w:p>
+            <w:pPr>
+              <w:spacing w:before="0" w:after="60"/>
+              <w:keepNext/>
+              <w:jc w:val="center"/>
+            </w:pPr>
+            <w:r>
+              <w:rPr>
+                <w:rFonts w:ascii="Calibri" w:hAnsi="Calibri"/>
+                <w:sz w:val="20"/>
+              </w:rPr>
+              <w:t xml:space="default">12.3</w:t>
+            </w:r>
+          </w:p>
+        </w:tc>
+        <w:tc>
+          <w:tcPr>
+            <w:tcBorders>
+              <w:top w:val="single" w:space="0" w:color="D3D3D3"/>
+              <w:bottom w:val="single" w:space="0" w:color="D3D3D3"/>
+              <w:start w:val="single" w:space="0" w:color="D3D3D3"/>
+              <w:end w:val="single" w:space="0" w:color="D3D3D3"/>
+            </w:tcBorders>
+          </w:tcPr>
+          <w:p>
+            <w:pPr>
+              <w:spacing w:before="0" w:after="60"/>
+              <w:keepNext/>
+              <w:jc w:val="center"/>
+            </w:pPr>
+            <w:r>
+              <w:rPr>
+                <w:rFonts w:ascii="Calibri" w:hAnsi="Calibri"/>
+                <w:sz w:val="20"/>
+              </w:rPr>
+              <w:t xml:space="default">6.4</w:t>
+            </w:r>
+          </w:p>
+        </w:tc>
+        <w:tc>
+          <w:tcPr>
+            <w:tcBorders>
+              <w:top w:val="single" w:space="0" w:color="D3D3D3"/>
+              <w:bottom w:val="single" w:space="0" w:color="D3D3D3"/>
+              <w:start w:val="single" w:space="0" w:color="D3D3D3"/>
+              <w:end w:val="single" w:space="0" w:color="D3D3D3"/>
+            </w:tcBorders>
+          </w:tcPr>
+          <w:p>
+            <w:pPr>
+              <w:spacing w:before="0" w:after="60"/>
+              <w:keepNext/>
+              <w:jc w:val="center"/>
+            </w:pPr>
+            <w:r>
+              <w:rPr>
+                <w:rFonts w:ascii="Calibri" w:hAnsi="Calibri"/>
+                <w:sz w:val="20"/>
+              </w:rPr>
+              <w:t xml:space="default">0.556</w:t>
             </w:r>
           </w:p>
         </w:tc>
@@ -1486,7 +1486,7 @@
                 <w:rFonts w:ascii="Calibri" w:hAnsi="Calibri"/>
                 <w:sz w:val="20"/>
               </w:rPr>
-              <w:t xml:space="default">Pooled</w:t>
+              <w:t xml:space="default">2025 - full</w:t>
             </w:r>
           </w:p>
         </w:tc>
@@ -1534,127 +1534,127 @@
                 <w:rFonts w:ascii="Calibri" w:hAnsi="Calibri"/>
                 <w:sz w:val="20"/>
               </w:rPr>
-              <w:t xml:space="default">6</w:t>
-            </w:r>
-          </w:p>
-        </w:tc>
-        <w:tc>
-          <w:tcPr>
-            <w:tcBorders>
-              <w:top w:val="single" w:space="0" w:color="D3D3D3"/>
-              <w:bottom w:val="single" w:space="0" w:color="D3D3D3"/>
-              <w:start w:val="single" w:space="0" w:color="D3D3D3"/>
-              <w:end w:val="single" w:space="0" w:color="D3D3D3"/>
-            </w:tcBorders>
-          </w:tcPr>
-          <w:p>
-            <w:pPr>
-              <w:spacing w:before="0" w:after="60"/>
-              <w:keepNext/>
-              <w:jc w:val="center"/>
-            </w:pPr>
-            <w:r>
-              <w:rPr>
-                <w:rFonts w:ascii="Calibri" w:hAnsi="Calibri"/>
-                <w:sz w:val="20"/>
-              </w:rPr>
-              <w:t xml:space="default">14</w:t>
-            </w:r>
-          </w:p>
-        </w:tc>
-        <w:tc>
-          <w:tcPr>
-            <w:tcBorders>
-              <w:top w:val="single" w:space="0" w:color="D3D3D3"/>
-              <w:bottom w:val="single" w:space="0" w:color="D3D3D3"/>
-              <w:start w:val="single" w:space="0" w:color="D3D3D3"/>
-              <w:end w:val="single" w:space="0" w:color="D3D3D3"/>
-            </w:tcBorders>
-          </w:tcPr>
-          <w:p>
-            <w:pPr>
-              <w:spacing w:before="0" w:after="60"/>
-              <w:keepNext/>
-              <w:jc w:val="center"/>
-            </w:pPr>
-            <w:r>
-              <w:rPr>
-                <w:rFonts w:ascii="Calibri" w:hAnsi="Calibri"/>
-                <w:sz w:val="20"/>
-              </w:rPr>
-              <w:t xml:space="default">0.933</w:t>
-            </w:r>
-          </w:p>
-        </w:tc>
-        <w:tc>
-          <w:tcPr>
-            <w:tcBorders>
-              <w:top w:val="single" w:space="0" w:color="D3D3D3"/>
-              <w:bottom w:val="single" w:space="0" w:color="D3D3D3"/>
-              <w:start w:val="single" w:space="0" w:color="D3D3D3"/>
-              <w:end w:val="single" w:space="0" w:color="D3D3D3"/>
-            </w:tcBorders>
-          </w:tcPr>
-          <w:p>
-            <w:pPr>
-              <w:spacing w:before="0" w:after="60"/>
-              <w:keepNext/>
-              <w:jc w:val="center"/>
-            </w:pPr>
-            <w:r>
-              <w:rPr>
-                <w:rFonts w:ascii="Calibri" w:hAnsi="Calibri"/>
-                <w:sz w:val="20"/>
-              </w:rPr>
-              <w:t xml:space="default">16.2</w:t>
-            </w:r>
-          </w:p>
-        </w:tc>
-        <w:tc>
-          <w:tcPr>
-            <w:tcBorders>
-              <w:top w:val="single" w:space="0" w:color="D3D3D3"/>
-              <w:bottom w:val="single" w:space="0" w:color="D3D3D3"/>
-              <w:start w:val="single" w:space="0" w:color="D3D3D3"/>
-              <w:end w:val="single" w:space="0" w:color="D3D3D3"/>
-            </w:tcBorders>
-          </w:tcPr>
-          <w:p>
-            <w:pPr>
-              <w:spacing w:before="0" w:after="60"/>
-              <w:keepNext/>
-              <w:jc w:val="center"/>
-            </w:pPr>
-            <w:r>
-              <w:rPr>
-                <w:rFonts w:ascii="Calibri" w:hAnsi="Calibri"/>
-                <w:sz w:val="20"/>
-              </w:rPr>
-              <w:t xml:space="default">7.0</w:t>
-            </w:r>
-          </w:p>
-        </w:tc>
-        <w:tc>
-          <w:tcPr>
-            <w:tcBorders>
-              <w:top w:val="single" w:space="0" w:color="D3D3D3"/>
-              <w:bottom w:val="single" w:space="0" w:color="D3D3D3"/>
-              <w:start w:val="single" w:space="0" w:color="D3D3D3"/>
-              <w:end w:val="single" w:space="0" w:color="D3D3D3"/>
-            </w:tcBorders>
-          </w:tcPr>
-          <w:p>
-            <w:pPr>
-              <w:spacing w:before="0" w:after="60"/>
-              <w:keepNext/>
-              <w:jc w:val="center"/>
-            </w:pPr>
-            <w:r>
-              <w:rPr>
-                <w:rFonts w:ascii="Calibri" w:hAnsi="Calibri"/>
-                <w:sz w:val="20"/>
-              </w:rPr>
-              <w:t xml:space="default">0.933</w:t>
+              <w:t xml:space="default">5</w:t>
+            </w:r>
+          </w:p>
+        </w:tc>
+        <w:tc>
+          <w:tcPr>
+            <w:tcBorders>
+              <w:top w:val="single" w:space="0" w:color="D3D3D3"/>
+              <w:bottom w:val="single" w:space="0" w:color="D3D3D3"/>
+              <w:start w:val="single" w:space="0" w:color="D3D3D3"/>
+              <w:end w:val="single" w:space="0" w:color="D3D3D3"/>
+            </w:tcBorders>
+          </w:tcPr>
+          <w:p>
+            <w:pPr>
+              <w:spacing w:before="0" w:after="60"/>
+              <w:keepNext/>
+              <w:jc w:val="center"/>
+            </w:pPr>
+            <w:r>
+              <w:rPr>
+                <w:rFonts w:ascii="Calibri" w:hAnsi="Calibri"/>
+                <w:sz w:val="20"/>
+              </w:rPr>
+              <w:t xml:space="default">10</w:t>
+            </w:r>
+          </w:p>
+        </w:tc>
+        <w:tc>
+          <w:tcPr>
+            <w:tcBorders>
+              <w:top w:val="single" w:space="0" w:color="D3D3D3"/>
+              <w:bottom w:val="single" w:space="0" w:color="D3D3D3"/>
+              <w:start w:val="single" w:space="0" w:color="D3D3D3"/>
+              <w:end w:val="single" w:space="0" w:color="D3D3D3"/>
+            </w:tcBorders>
+          </w:tcPr>
+          <w:p>
+            <w:pPr>
+              <w:spacing w:before="0" w:after="60"/>
+              <w:keepNext/>
+              <w:jc w:val="center"/>
+            </w:pPr>
+            <w:r>
+              <w:rPr>
+                <w:rFonts w:ascii="Calibri" w:hAnsi="Calibri"/>
+                <w:sz w:val="20"/>
+              </w:rPr>
+              <w:t xml:space="default">1.000</w:t>
+            </w:r>
+          </w:p>
+        </w:tc>
+        <w:tc>
+          <w:tcPr>
+            <w:tcBorders>
+              <w:top w:val="single" w:space="0" w:color="D3D3D3"/>
+              <w:bottom w:val="single" w:space="0" w:color="D3D3D3"/>
+              <w:start w:val="single" w:space="0" w:color="D3D3D3"/>
+              <w:end w:val="single" w:space="0" w:color="D3D3D3"/>
+            </w:tcBorders>
+          </w:tcPr>
+          <w:p>
+            <w:pPr>
+              <w:spacing w:before="0" w:after="60"/>
+              <w:keepNext/>
+              <w:jc w:val="center"/>
+            </w:pPr>
+            <w:r>
+              <w:rPr>
+                <w:rFonts w:ascii="Calibri" w:hAnsi="Calibri"/>
+                <w:sz w:val="20"/>
+              </w:rPr>
+              <w:t xml:space="default">5.7</w:t>
+            </w:r>
+          </w:p>
+        </w:tc>
+        <w:tc>
+          <w:tcPr>
+            <w:tcBorders>
+              <w:top w:val="single" w:space="0" w:color="D3D3D3"/>
+              <w:bottom w:val="single" w:space="0" w:color="D3D3D3"/>
+              <w:start w:val="single" w:space="0" w:color="D3D3D3"/>
+              <w:end w:val="single" w:space="0" w:color="D3D3D3"/>
+            </w:tcBorders>
+          </w:tcPr>
+          <w:p>
+            <w:pPr>
+              <w:spacing w:before="0" w:after="60"/>
+              <w:keepNext/>
+              <w:jc w:val="center"/>
+            </w:pPr>
+            <w:r>
+              <w:rPr>
+                <w:rFonts w:ascii="Calibri" w:hAnsi="Calibri"/>
+                <w:sz w:val="20"/>
+              </w:rPr>
+              <w:t xml:space="default">3.4</w:t>
+            </w:r>
+          </w:p>
+        </w:tc>
+        <w:tc>
+          <w:tcPr>
+            <w:tcBorders>
+              <w:top w:val="single" w:space="0" w:color="D3D3D3"/>
+              <w:bottom w:val="single" w:space="0" w:color="D3D3D3"/>
+              <w:start w:val="single" w:space="0" w:color="D3D3D3"/>
+              <w:end w:val="single" w:space="0" w:color="D3D3D3"/>
+            </w:tcBorders>
+          </w:tcPr>
+          <w:p>
+            <w:pPr>
+              <w:spacing w:before="0" w:after="60"/>
+              <w:keepNext/>
+              <w:jc w:val="center"/>
+            </w:pPr>
+            <w:r>
+              <w:rPr>
+                <w:rFonts w:ascii="Calibri" w:hAnsi="Calibri"/>
+                <w:sz w:val="20"/>
+              </w:rPr>
+              <w:t xml:space="default">1.000</w:t>
             </w:r>
           </w:p>
         </w:tc>
@@ -1683,7 +1683,7 @@
                 <w:rFonts w:ascii="Calibri" w:hAnsi="Calibri"/>
                 <w:sz w:val="20"/>
               </w:rPr>
-              <w:t xml:space="default">Pooled</w:t>
+              <w:t xml:space="default">2025 - full</w:t>
             </w:r>
           </w:p>
         </w:tc>
@@ -1731,127 +1731,127 @@
                 <w:rFonts w:ascii="Calibri" w:hAnsi="Calibri"/>
                 <w:sz w:val="20"/>
               </w:rPr>
-              <w:t xml:space="default">9</w:t>
-            </w:r>
-          </w:p>
-        </w:tc>
-        <w:tc>
-          <w:tcPr>
-            <w:tcBorders>
-              <w:top w:val="single" w:space="0" w:color="D3D3D3"/>
-              <w:bottom w:val="single" w:space="0" w:color="D3D3D3"/>
-              <w:start w:val="single" w:space="0" w:color="D3D3D3"/>
-              <w:end w:val="single" w:space="0" w:color="D3D3D3"/>
-            </w:tcBorders>
-          </w:tcPr>
-          <w:p>
-            <w:pPr>
-              <w:spacing w:before="0" w:after="60"/>
-              <w:keepNext/>
-              <w:jc w:val="center"/>
-            </w:pPr>
-            <w:r>
-              <w:rPr>
-                <w:rFonts w:ascii="Calibri" w:hAnsi="Calibri"/>
-                <w:sz w:val="20"/>
-              </w:rPr>
-              <w:t xml:space="default">22</w:t>
-            </w:r>
-          </w:p>
-        </w:tc>
-        <w:tc>
-          <w:tcPr>
-            <w:tcBorders>
-              <w:top w:val="single" w:space="0" w:color="D3D3D3"/>
-              <w:bottom w:val="single" w:space="0" w:color="D3D3D3"/>
-              <w:start w:val="single" w:space="0" w:color="D3D3D3"/>
-              <w:end w:val="single" w:space="0" w:color="D3D3D3"/>
-            </w:tcBorders>
-          </w:tcPr>
-          <w:p>
-            <w:pPr>
-              <w:spacing w:before="0" w:after="60"/>
-              <w:keepNext/>
-              <w:jc w:val="center"/>
-            </w:pPr>
-            <w:r>
-              <w:rPr>
-                <w:rFonts w:ascii="Calibri" w:hAnsi="Calibri"/>
-                <w:sz w:val="20"/>
-              </w:rPr>
-              <w:t xml:space="default">0.611</w:t>
-            </w:r>
-          </w:p>
-        </w:tc>
-        <w:tc>
-          <w:tcPr>
-            <w:tcBorders>
-              <w:top w:val="single" w:space="0" w:color="D3D3D3"/>
-              <w:bottom w:val="single" w:space="0" w:color="D3D3D3"/>
-              <w:start w:val="single" w:space="0" w:color="D3D3D3"/>
-              <w:end w:val="single" w:space="0" w:color="D3D3D3"/>
-            </w:tcBorders>
-          </w:tcPr>
-          <w:p>
-            <w:pPr>
-              <w:spacing w:before="0" w:after="60"/>
-              <w:keepNext/>
-              <w:jc w:val="center"/>
-            </w:pPr>
-            <w:r>
-              <w:rPr>
-                <w:rFonts w:ascii="Calibri" w:hAnsi="Calibri"/>
-                <w:sz w:val="20"/>
-              </w:rPr>
-              <w:t xml:space="default">34.1</w:t>
-            </w:r>
-          </w:p>
-        </w:tc>
-        <w:tc>
-          <w:tcPr>
-            <w:tcBorders>
-              <w:top w:val="single" w:space="0" w:color="D3D3D3"/>
-              <w:bottom w:val="single" w:space="0" w:color="D3D3D3"/>
-              <w:start w:val="single" w:space="0" w:color="D3D3D3"/>
-              <w:end w:val="single" w:space="0" w:color="D3D3D3"/>
-            </w:tcBorders>
-          </w:tcPr>
-          <w:p>
-            <w:pPr>
-              <w:spacing w:before="0" w:after="60"/>
-              <w:keepNext/>
-              <w:jc w:val="center"/>
-            </w:pPr>
-            <w:r>
-              <w:rPr>
-                <w:rFonts w:ascii="Calibri" w:hAnsi="Calibri"/>
-                <w:sz w:val="20"/>
-              </w:rPr>
-              <w:t xml:space="default">14.1</w:t>
-            </w:r>
-          </w:p>
-        </w:tc>
-        <w:tc>
-          <w:tcPr>
-            <w:tcBorders>
-              <w:top w:val="single" w:space="0" w:color="D3D3D3"/>
-              <w:bottom w:val="single" w:space="0" w:color="D3D3D3"/>
-              <w:start w:val="single" w:space="0" w:color="D3D3D3"/>
-              <w:end w:val="single" w:space="0" w:color="D3D3D3"/>
-            </w:tcBorders>
-          </w:tcPr>
-          <w:p>
-            <w:pPr>
-              <w:spacing w:before="0" w:after="60"/>
-              <w:keepNext/>
-              <w:jc w:val="center"/>
-            </w:pPr>
-            <w:r>
-              <w:rPr>
-                <w:rFonts w:ascii="Calibri" w:hAnsi="Calibri"/>
-                <w:sz w:val="20"/>
-              </w:rPr>
-              <w:t xml:space="default">0.821</w:t>
+              <w:t xml:space="default">8</w:t>
+            </w:r>
+          </w:p>
+        </w:tc>
+        <w:tc>
+          <w:tcPr>
+            <w:tcBorders>
+              <w:top w:val="single" w:space="0" w:color="D3D3D3"/>
+              <w:bottom w:val="single" w:space="0" w:color="D3D3D3"/>
+              <w:start w:val="single" w:space="0" w:color="D3D3D3"/>
+              <w:end w:val="single" w:space="0" w:color="D3D3D3"/>
+            </w:tcBorders>
+          </w:tcPr>
+          <w:p>
+            <w:pPr>
+              <w:spacing w:before="0" w:after="60"/>
+              <w:keepNext/>
+              <w:jc w:val="center"/>
+            </w:pPr>
+            <w:r>
+              <w:rPr>
+                <w:rFonts w:ascii="Calibri" w:hAnsi="Calibri"/>
+                <w:sz w:val="20"/>
+              </w:rPr>
+              <w:t xml:space="default">18</w:t>
+            </w:r>
+          </w:p>
+        </w:tc>
+        <w:tc>
+          <w:tcPr>
+            <w:tcBorders>
+              <w:top w:val="single" w:space="0" w:color="D3D3D3"/>
+              <w:bottom w:val="single" w:space="0" w:color="D3D3D3"/>
+              <w:start w:val="single" w:space="0" w:color="D3D3D3"/>
+              <w:end w:val="single" w:space="0" w:color="D3D3D3"/>
+            </w:tcBorders>
+          </w:tcPr>
+          <w:p>
+            <w:pPr>
+              <w:spacing w:before="0" w:after="60"/>
+              <w:keepNext/>
+              <w:jc w:val="center"/>
+            </w:pPr>
+            <w:r>
+              <w:rPr>
+                <w:rFonts w:ascii="Calibri" w:hAnsi="Calibri"/>
+                <w:sz w:val="20"/>
+              </w:rPr>
+              <w:t xml:space="default">0.643</w:t>
+            </w:r>
+          </w:p>
+        </w:tc>
+        <w:tc>
+          <w:tcPr>
+            <w:tcBorders>
+              <w:top w:val="single" w:space="0" w:color="D3D3D3"/>
+              <w:bottom w:val="single" w:space="0" w:color="D3D3D3"/>
+              <w:start w:val="single" w:space="0" w:color="D3D3D3"/>
+              <w:end w:val="single" w:space="0" w:color="D3D3D3"/>
+            </w:tcBorders>
+          </w:tcPr>
+          <w:p>
+            <w:pPr>
+              <w:spacing w:before="0" w:after="60"/>
+              <w:keepNext/>
+              <w:jc w:val="center"/>
+            </w:pPr>
+            <w:r>
+              <w:rPr>
+                <w:rFonts w:ascii="Calibri" w:hAnsi="Calibri"/>
+                <w:sz w:val="20"/>
+              </w:rPr>
+              <w:t xml:space="default">34.4</w:t>
+            </w:r>
+          </w:p>
+        </w:tc>
+        <w:tc>
+          <w:tcPr>
+            <w:tcBorders>
+              <w:top w:val="single" w:space="0" w:color="D3D3D3"/>
+              <w:bottom w:val="single" w:space="0" w:color="D3D3D3"/>
+              <w:start w:val="single" w:space="0" w:color="D3D3D3"/>
+              <w:end w:val="single" w:space="0" w:color="D3D3D3"/>
+            </w:tcBorders>
+          </w:tcPr>
+          <w:p>
+            <w:pPr>
+              <w:spacing w:before="0" w:after="60"/>
+              <w:keepNext/>
+              <w:jc w:val="center"/>
+            </w:pPr>
+            <w:r>
+              <w:rPr>
+                <w:rFonts w:ascii="Calibri" w:hAnsi="Calibri"/>
+                <w:sz w:val="20"/>
+              </w:rPr>
+              <w:t xml:space="default">14.4</w:t>
+            </w:r>
+          </w:p>
+        </w:tc>
+        <w:tc>
+          <w:tcPr>
+            <w:tcBorders>
+              <w:top w:val="single" w:space="0" w:color="D3D3D3"/>
+              <w:bottom w:val="single" w:space="0" w:color="D3D3D3"/>
+              <w:start w:val="single" w:space="0" w:color="D3D3D3"/>
+              <w:end w:val="single" w:space="0" w:color="D3D3D3"/>
+            </w:tcBorders>
+          </w:tcPr>
+          <w:p>
+            <w:pPr>
+              <w:spacing w:before="0" w:after="60"/>
+              <w:keepNext/>
+              <w:jc w:val="center"/>
+            </w:pPr>
+            <w:r>
+              <w:rPr>
+                <w:rFonts w:ascii="Calibri" w:hAnsi="Calibri"/>
+                <w:sz w:val="20"/>
+              </w:rPr>
+              <w:t xml:space="default">0.832</w:t>
             </w:r>
           </w:p>
         </w:tc>
@@ -3488,7 +3488,7 @@
                 <w:rFonts w:ascii="Calibri" w:hAnsi="Calibri"/>
                 <w:sz w:val="20"/>
               </w:rPr>
-              <w:t xml:space="default">Pooled</w:t>
+              <w:t xml:space="default">2025 - full</w:t>
             </w:r>
           </w:p>
         </w:tc>
@@ -3560,103 +3560,103 @@
                 <w:rFonts w:ascii="Calibri" w:hAnsi="Calibri"/>
                 <w:sz w:val="20"/>
               </w:rPr>
-              <w:t xml:space="default">37</w:t>
-            </w:r>
-          </w:p>
-        </w:tc>
-        <w:tc>
-          <w:tcPr>
-            <w:tcBorders>
-              <w:top w:val="single" w:space="0" w:color="D3D3D3"/>
-              <w:bottom w:val="single" w:space="0" w:color="D3D3D3"/>
-              <w:start w:val="single" w:space="0" w:color="D3D3D3"/>
-              <w:end w:val="single" w:space="0" w:color="D3D3D3"/>
-            </w:tcBorders>
-          </w:tcPr>
-          <w:p>
-            <w:pPr>
-              <w:spacing w:before="0" w:after="60"/>
-              <w:keepNext/>
-              <w:jc w:val="center"/>
-            </w:pPr>
-            <w:r>
-              <w:rPr>
-                <w:rFonts w:ascii="Calibri" w:hAnsi="Calibri"/>
-                <w:sz w:val="20"/>
-              </w:rPr>
-              <w:t xml:space="default">0.822</w:t>
-            </w:r>
-          </w:p>
-        </w:tc>
-        <w:tc>
-          <w:tcPr>
-            <w:tcBorders>
-              <w:top w:val="single" w:space="0" w:color="D3D3D3"/>
-              <w:bottom w:val="single" w:space="0" w:color="D3D3D3"/>
-              <w:start w:val="single" w:space="0" w:color="D3D3D3"/>
-              <w:end w:val="single" w:space="0" w:color="D3D3D3"/>
-            </w:tcBorders>
-          </w:tcPr>
-          <w:p>
-            <w:pPr>
-              <w:spacing w:before="0" w:after="60"/>
-              <w:keepNext/>
-              <w:jc w:val="center"/>
-            </w:pPr>
-            <w:r>
-              <w:rPr>
-                <w:rFonts w:ascii="Calibri" w:hAnsi="Calibri"/>
-                <w:sz w:val="20"/>
-              </w:rPr>
-              <w:t xml:space="default">57.0</w:t>
-            </w:r>
-          </w:p>
-        </w:tc>
-        <w:tc>
-          <w:tcPr>
-            <w:tcBorders>
-              <w:top w:val="single" w:space="0" w:color="D3D3D3"/>
-              <w:bottom w:val="single" w:space="0" w:color="D3D3D3"/>
-              <w:start w:val="single" w:space="0" w:color="D3D3D3"/>
-              <w:end w:val="single" w:space="0" w:color="D3D3D3"/>
-            </w:tcBorders>
-          </w:tcPr>
-          <w:p>
-            <w:pPr>
-              <w:spacing w:before="0" w:after="60"/>
-              <w:keepNext/>
-              <w:jc w:val="center"/>
-            </w:pPr>
-            <w:r>
-              <w:rPr>
-                <w:rFonts w:ascii="Calibri" w:hAnsi="Calibri"/>
-                <w:sz w:val="20"/>
-              </w:rPr>
-              <w:t xml:space="default">20.8</w:t>
-            </w:r>
-          </w:p>
-        </w:tc>
-        <w:tc>
-          <w:tcPr>
-            <w:tcBorders>
-              <w:top w:val="single" w:space="0" w:color="D3D3D3"/>
-              <w:bottom w:val="single" w:space="0" w:color="D3D3D3"/>
-              <w:start w:val="single" w:space="0" w:color="D3D3D3"/>
-              <w:end w:val="single" w:space="0" w:color="D3D3D3"/>
-            </w:tcBorders>
-          </w:tcPr>
-          <w:p>
-            <w:pPr>
-              <w:spacing w:before="0" w:after="60"/>
-              <w:keepNext/>
-              <w:jc w:val="center"/>
-            </w:pPr>
-            <w:r>
-              <w:rPr>
-                <w:rFonts w:ascii="Calibri" w:hAnsi="Calibri"/>
-                <w:sz w:val="20"/>
-              </w:rPr>
-              <w:t xml:space="default">0.820</w:t>
+              <w:t xml:space="default">42</w:t>
+            </w:r>
+          </w:p>
+        </w:tc>
+        <w:tc>
+          <w:tcPr>
+            <w:tcBorders>
+              <w:top w:val="single" w:space="0" w:color="D3D3D3"/>
+              <w:bottom w:val="single" w:space="0" w:color="D3D3D3"/>
+              <w:start w:val="single" w:space="0" w:color="D3D3D3"/>
+              <w:end w:val="single" w:space="0" w:color="D3D3D3"/>
+            </w:tcBorders>
+          </w:tcPr>
+          <w:p>
+            <w:pPr>
+              <w:spacing w:before="0" w:after="60"/>
+              <w:keepNext/>
+              <w:jc w:val="center"/>
+            </w:pPr>
+            <w:r>
+              <w:rPr>
+                <w:rFonts w:ascii="Calibri" w:hAnsi="Calibri"/>
+                <w:sz w:val="20"/>
+              </w:rPr>
+              <w:t xml:space="default">0.933</w:t>
+            </w:r>
+          </w:p>
+        </w:tc>
+        <w:tc>
+          <w:tcPr>
+            <w:tcBorders>
+              <w:top w:val="single" w:space="0" w:color="D3D3D3"/>
+              <w:bottom w:val="single" w:space="0" w:color="D3D3D3"/>
+              <w:start w:val="single" w:space="0" w:color="D3D3D3"/>
+              <w:end w:val="single" w:space="0" w:color="D3D3D3"/>
+            </w:tcBorders>
+          </w:tcPr>
+          <w:p>
+            <w:pPr>
+              <w:spacing w:before="0" w:after="60"/>
+              <w:keepNext/>
+              <w:jc w:val="center"/>
+            </w:pPr>
+            <w:r>
+              <w:rPr>
+                <w:rFonts w:ascii="Calibri" w:hAnsi="Calibri"/>
+                <w:sz w:val="20"/>
+              </w:rPr>
+              <w:t xml:space="default">15.2</w:t>
+            </w:r>
+          </w:p>
+        </w:tc>
+        <w:tc>
+          <w:tcPr>
+            <w:tcBorders>
+              <w:top w:val="single" w:space="0" w:color="D3D3D3"/>
+              <w:bottom w:val="single" w:space="0" w:color="D3D3D3"/>
+              <w:start w:val="single" w:space="0" w:color="D3D3D3"/>
+              <w:end w:val="single" w:space="0" w:color="D3D3D3"/>
+            </w:tcBorders>
+          </w:tcPr>
+          <w:p>
+            <w:pPr>
+              <w:spacing w:before="0" w:after="60"/>
+              <w:keepNext/>
+              <w:jc w:val="center"/>
+            </w:pPr>
+            <w:r>
+              <w:rPr>
+                <w:rFonts w:ascii="Calibri" w:hAnsi="Calibri"/>
+                <w:sz w:val="20"/>
+              </w:rPr>
+              <w:t xml:space="default">7.0</w:t>
+            </w:r>
+          </w:p>
+        </w:tc>
+        <w:tc>
+          <w:tcPr>
+            <w:tcBorders>
+              <w:top w:val="single" w:space="0" w:color="D3D3D3"/>
+              <w:bottom w:val="single" w:space="0" w:color="D3D3D3"/>
+              <w:start w:val="single" w:space="0" w:color="D3D3D3"/>
+              <w:end w:val="single" w:space="0" w:color="D3D3D3"/>
+            </w:tcBorders>
+          </w:tcPr>
+          <w:p>
+            <w:pPr>
+              <w:spacing w:before="0" w:after="60"/>
+              <w:keepNext/>
+              <w:jc w:val="center"/>
+            </w:pPr>
+            <w:r>
+              <w:rPr>
+                <w:rFonts w:ascii="Calibri" w:hAnsi="Calibri"/>
+                <w:sz w:val="20"/>
+              </w:rPr>
+              <w:t xml:space="default">0.943</w:t>
             </w:r>
           </w:p>
         </w:tc>
@@ -3685,7 +3685,7 @@
                 <w:rFonts w:ascii="Calibri" w:hAnsi="Calibri"/>
                 <w:sz w:val="20"/>
               </w:rPr>
-              <w:t xml:space="default">Pooled</w:t>
+              <w:t xml:space="default">2025 - full</w:t>
             </w:r>
           </w:p>
         </w:tc>
@@ -3733,127 +3733,127 @@
                 <w:rFonts w:ascii="Calibri" w:hAnsi="Calibri"/>
                 <w:sz w:val="20"/>
               </w:rPr>
-              <w:t xml:space="default">14</w:t>
-            </w:r>
-          </w:p>
-        </w:tc>
-        <w:tc>
-          <w:tcPr>
-            <w:tcBorders>
-              <w:top w:val="single" w:space="0" w:color="D3D3D3"/>
-              <w:bottom w:val="single" w:space="0" w:color="D3D3D3"/>
-              <w:start w:val="single" w:space="0" w:color="D3D3D3"/>
-              <w:end w:val="single" w:space="0" w:color="D3D3D3"/>
-            </w:tcBorders>
-          </w:tcPr>
-          <w:p>
-            <w:pPr>
-              <w:spacing w:before="0" w:after="60"/>
-              <w:keepNext/>
-              <w:jc w:val="center"/>
-            </w:pPr>
-            <w:r>
-              <w:rPr>
-                <w:rFonts w:ascii="Calibri" w:hAnsi="Calibri"/>
-                <w:sz w:val="20"/>
-              </w:rPr>
-              <w:t xml:space="default">48</w:t>
-            </w:r>
-          </w:p>
-        </w:tc>
-        <w:tc>
-          <w:tcPr>
-            <w:tcBorders>
-              <w:top w:val="single" w:space="0" w:color="D3D3D3"/>
-              <w:bottom w:val="single" w:space="0" w:color="D3D3D3"/>
-              <w:start w:val="single" w:space="0" w:color="D3D3D3"/>
-              <w:end w:val="single" w:space="0" w:color="D3D3D3"/>
-            </w:tcBorders>
-          </w:tcPr>
-          <w:p>
-            <w:pPr>
-              <w:spacing w:before="0" w:after="60"/>
-              <w:keepNext/>
-              <w:jc w:val="center"/>
-            </w:pPr>
-            <w:r>
-              <w:rPr>
-                <w:rFonts w:ascii="Calibri" w:hAnsi="Calibri"/>
-                <w:sz w:val="20"/>
-              </w:rPr>
-              <w:t xml:space="default">0.527</w:t>
-            </w:r>
-          </w:p>
-        </w:tc>
-        <w:tc>
-          <w:tcPr>
-            <w:tcBorders>
-              <w:top w:val="single" w:space="0" w:color="D3D3D3"/>
-              <w:bottom w:val="single" w:space="0" w:color="D3D3D3"/>
-              <w:start w:val="single" w:space="0" w:color="D3D3D3"/>
-              <w:end w:val="single" w:space="0" w:color="D3D3D3"/>
-            </w:tcBorders>
-          </w:tcPr>
-          <w:p>
-            <w:pPr>
-              <w:spacing w:before="0" w:after="60"/>
-              <w:keepNext/>
-              <w:jc w:val="center"/>
-            </w:pPr>
-            <w:r>
-              <w:rPr>
-                <w:rFonts w:ascii="Calibri" w:hAnsi="Calibri"/>
-                <w:sz w:val="20"/>
-              </w:rPr>
-              <w:t xml:space="default">105.9</w:t>
-            </w:r>
-          </w:p>
-        </w:tc>
-        <w:tc>
-          <w:tcPr>
-            <w:tcBorders>
-              <w:top w:val="single" w:space="0" w:color="D3D3D3"/>
-              <w:bottom w:val="single" w:space="0" w:color="D3D3D3"/>
-              <w:start w:val="single" w:space="0" w:color="D3D3D3"/>
-              <w:end w:val="single" w:space="0" w:color="D3D3D3"/>
-            </w:tcBorders>
-          </w:tcPr>
-          <w:p>
-            <w:pPr>
-              <w:spacing w:before="0" w:after="60"/>
-              <w:keepNext/>
-              <w:jc w:val="center"/>
-            </w:pPr>
-            <w:r>
-              <w:rPr>
-                <w:rFonts w:ascii="Calibri" w:hAnsi="Calibri"/>
-                <w:sz w:val="20"/>
-              </w:rPr>
-              <w:t xml:space="default">40.8</w:t>
-            </w:r>
-          </w:p>
-        </w:tc>
-        <w:tc>
-          <w:tcPr>
-            <w:tcBorders>
-              <w:top w:val="single" w:space="0" w:color="D3D3D3"/>
-              <w:bottom w:val="single" w:space="0" w:color="D3D3D3"/>
-              <w:start w:val="single" w:space="0" w:color="D3D3D3"/>
-              <w:end w:val="single" w:space="0" w:color="D3D3D3"/>
-            </w:tcBorders>
-          </w:tcPr>
-          <w:p>
-            <w:pPr>
-              <w:spacing w:before="0" w:after="60"/>
-              <w:keepNext/>
-              <w:jc w:val="center"/>
-            </w:pPr>
-            <w:r>
-              <w:rPr>
-                <w:rFonts w:ascii="Calibri" w:hAnsi="Calibri"/>
-                <w:sz w:val="20"/>
-              </w:rPr>
-              <w:t xml:space="default">0.606</w:t>
+              <w:t xml:space="default">10</w:t>
+            </w:r>
+          </w:p>
+        </w:tc>
+        <w:tc>
+          <w:tcPr>
+            <w:tcBorders>
+              <w:top w:val="single" w:space="0" w:color="D3D3D3"/>
+              <w:bottom w:val="single" w:space="0" w:color="D3D3D3"/>
+              <w:start w:val="single" w:space="0" w:color="D3D3D3"/>
+              <w:end w:val="single" w:space="0" w:color="D3D3D3"/>
+            </w:tcBorders>
+          </w:tcPr>
+          <w:p>
+            <w:pPr>
+              <w:spacing w:before="0" w:after="60"/>
+              <w:keepNext/>
+              <w:jc w:val="center"/>
+            </w:pPr>
+            <w:r>
+              <w:rPr>
+                <w:rFonts w:ascii="Calibri" w:hAnsi="Calibri"/>
+                <w:sz w:val="20"/>
+              </w:rPr>
+              <w:t xml:space="default">39</w:t>
+            </w:r>
+          </w:p>
+        </w:tc>
+        <w:tc>
+          <w:tcPr>
+            <w:tcBorders>
+              <w:top w:val="single" w:space="0" w:color="D3D3D3"/>
+              <w:bottom w:val="single" w:space="0" w:color="D3D3D3"/>
+              <w:start w:val="single" w:space="0" w:color="D3D3D3"/>
+              <w:end w:val="single" w:space="0" w:color="D3D3D3"/>
+            </w:tcBorders>
+          </w:tcPr>
+          <w:p>
+            <w:pPr>
+              <w:spacing w:before="0" w:after="60"/>
+              <w:keepNext/>
+              <w:jc w:val="center"/>
+            </w:pPr>
+            <w:r>
+              <w:rPr>
+                <w:rFonts w:ascii="Calibri" w:hAnsi="Calibri"/>
+                <w:sz w:val="20"/>
+              </w:rPr>
+              <w:t xml:space="default">0.867</w:t>
+            </w:r>
+          </w:p>
+        </w:tc>
+        <w:tc>
+          <w:tcPr>
+            <w:tcBorders>
+              <w:top w:val="single" w:space="0" w:color="D3D3D3"/>
+              <w:bottom w:val="single" w:space="0" w:color="D3D3D3"/>
+              <w:start w:val="single" w:space="0" w:color="D3D3D3"/>
+              <w:end w:val="single" w:space="0" w:color="D3D3D3"/>
+            </w:tcBorders>
+          </w:tcPr>
+          <w:p>
+            <w:pPr>
+              <w:spacing w:before="0" w:after="60"/>
+              <w:keepNext/>
+              <w:jc w:val="center"/>
+            </w:pPr>
+            <w:r>
+              <w:rPr>
+                <w:rFonts w:ascii="Calibri" w:hAnsi="Calibri"/>
+                <w:sz w:val="20"/>
+              </w:rPr>
+              <w:t xml:space="default">27.3</w:t>
+            </w:r>
+          </w:p>
+        </w:tc>
+        <w:tc>
+          <w:tcPr>
+            <w:tcBorders>
+              <w:top w:val="single" w:space="0" w:color="D3D3D3"/>
+              <w:bottom w:val="single" w:space="0" w:color="D3D3D3"/>
+              <w:start w:val="single" w:space="0" w:color="D3D3D3"/>
+              <w:end w:val="single" w:space="0" w:color="D3D3D3"/>
+            </w:tcBorders>
+          </w:tcPr>
+          <w:p>
+            <w:pPr>
+              <w:spacing w:before="0" w:after="60"/>
+              <w:keepNext/>
+              <w:jc w:val="center"/>
+            </w:pPr>
+            <w:r>
+              <w:rPr>
+                <w:rFonts w:ascii="Calibri" w:hAnsi="Calibri"/>
+                <w:sz w:val="20"/>
+              </w:rPr>
+              <w:t xml:space="default">12.5</w:t>
+            </w:r>
+          </w:p>
+        </w:tc>
+        <w:tc>
+          <w:tcPr>
+            <w:tcBorders>
+              <w:top w:val="single" w:space="0" w:color="D3D3D3"/>
+              <w:bottom w:val="single" w:space="0" w:color="D3D3D3"/>
+              <w:start w:val="single" w:space="0" w:color="D3D3D3"/>
+              <w:end w:val="single" w:space="0" w:color="D3D3D3"/>
+            </w:tcBorders>
+          </w:tcPr>
+          <w:p>
+            <w:pPr>
+              <w:spacing w:before="0" w:after="60"/>
+              <w:keepNext/>
+              <w:jc w:val="center"/>
+            </w:pPr>
+            <w:r>
+              <w:rPr>
+                <w:rFonts w:ascii="Calibri" w:hAnsi="Calibri"/>
+                <w:sz w:val="20"/>
+              </w:rPr>
+              <w:t xml:space="default">0.865</w:t>
             </w:r>
           </w:p>
         </w:tc>

</xml_diff>